<commit_message>
R3 Comment 1: keep only the empirical-decomposition plan
Previous response gave two items (empirical decomposition + interim
qualitative). User requested using only item 1 (the empirical plan).
Dropped the interim-qualitative item and inlined the empirical-
decomposition commitment as the single response.

The response now states directly that the next revision will run four
component-removal Phase 2 retrains (world model off / action chunking
off / TemporalEnsemble off / cross-dataset off) at ~2h each, reporting
per-component accuracy deltas in a new subsection 6.3a "Component-wise
decomposition".

Co-Authored-By: Claude Opus 4.7 <noreply@anthropic.com>
</commit_message>
<xml_diff>
--- a/paper/Terrainformer_MDPI/Response_to_Reviewer_3.docx
+++ b/paper/Terrainformer_MDPI/Response_to_Reviewer_3.docx
@@ -271,51 +271,7 @@
     <w:p>
       <w:r>
         <w:rPr/>
-        <w:t xml:space="preserve">We propose to address this in the next revision in two steps:</w:t>
-      </w:r>
-    </w:p>
-    <w:p>
-      <w:pPr>
-        <w:pStyle w:val="ListParagraph"/>
-        <w:numPr>
-          <w:ilvl w:val="0"/>
-          <w:numId w:val="2"/>
-        </w:numPr>
-      </w:pPr>
-      <w:r>
-        <w:rPr>
-          <w:b/>
-        </w:rPr>
-        <w:t xml:space="preserve">Empirical decomposition (planned)</w:t>
-      </w:r>
-      <w:r>
-        <w:rPr/>
-        <w:t xml:space="preserve">: run four additional Phase 2 retrains, each with one component removed: (i) world model off (decision transformer reads raw BEV features), (ii) action chunking off ($K{=}1$, no TemporalEnsemble), (iii) TemporalEnsemble off ($K{=}5$ but argmax-per-frame instead of weighted average), and (iv) cross-dataset protocol off (Phase 1 also trained on RELLIS-3D). Each retrain is approximately 2 hours on a Quadro RTX 8000; the total compute is approximately 8 hours. Results would form a new subsection 6.3a "Component-wise decomposition" within the existing Ablation Studies section.</w:t>
-      </w:r>
-    </w:p>
-    <w:p>
-      <w:pPr>
-        <w:pStyle w:val="ListParagraph"/>
-        <w:numPr>
-          <w:ilvl w:val="0"/>
-          <w:numId w:val="2"/>
-        </w:numPr>
-      </w:pPr>
-      <w:r>
-        <w:rPr>
-          <w:b/>
-        </w:rPr>
-        <w:t xml:space="preserve">Interim qualitative decomposition</w:t>
-      </w:r>
-      <w:r>
-        <w:rPr/>
-        <w:t xml:space="preserve">: in the meantime, we will expand Section 6.2 to add the following decomposition argument from the existing measurements: the 0.79\% drop comprises (i) world-model prediction error introduced when its 5-frame future BEV reconstruction deviates from the ground truth, and (ii) the policy's robustness to that deviation, which TemporalEnsemble's weighted average across overlapping chunks partially absorbs. The 98.82\% agreement rate already bounds the policy-robustness contribution from below, since most predictions are unchanged regardless of which frame is fed in.</w:t>
-      </w:r>
-    </w:p>
-    <w:p>
-      <w:r>
-        <w:rPr/>
-        <w:t xml:space="preserve">We will defer the empirical decomposition (item 1) to the next revision pass and clearly mark the planned experiments in Section 6.</w:t>
+        <w:t xml:space="preserve">We will address this in the next revision via empirical decomposition: run four additional Phase 2 retrains, each with one component removed: (i) world model off (decision transformer reads raw BEV features), (ii) action chunking off ($K{=}1$, no TemporalEnsemble), (iii) TemporalEnsemble off ($K{=}5$ but argmax-per-frame instead of weighted average), and (iv) cross-dataset protocol off (Phase 1 also trained on RELLIS-3D). Each retrain is approximately 2 hours on a Quadro RTX 8000; the total compute is approximately 8 hours. Results will form a new subsection 6.3a "Component-wise decomposition" within the existing Ablation Studies section, with the per-component accuracy delta reported against the full-model baseline so that the dominant architectural contributors to cross-dataset generalisation are explicit. The planned experiments are clearly marked in Section 6 of the revised manuscript.</w:t>
       </w:r>
     </w:p>
     <w:p>

</xml_diff>

<commit_message>
Standardize Response_to_Reviewer_3 + paper on US English
Carrying the US-English standardization (commit a7abcec) over to
Response_to_Reviewer_3.md/docx, plus catching two more UK words I
missed in the paper.

Response_to_Reviewer_3.md substitutions (6 total):
- behavioural    -> behavioral (1x)
- behaviour      -> behavior (1x)
- generalisation -> generalization (1x)
- modelling      -> modeling (1x)
- initialisation -> initialization (2x)

Paper substitutions (catching missed cases, 2 total):
- initialisation -> initialization (1x)
- stabilisation  -> stabilization (1x)

PDFs rebuilt; latexdiff re-run for diff PDF.

Co-Authored-By: Claude Opus 4.7 <noreply@anthropic.com>
</commit_message>
<xml_diff>
--- a/paper/Terrainformer_MDPI/Response_to_Reviewer_3.docx
+++ b/paper/Terrainformer_MDPI/Response_to_Reviewer_3.docx
@@ -149,7 +149,7 @@
           <w:p>
             <w:r>
               <w:rPr/>
-              <w:t xml:space="preserve">Yes; the cross-dataset training protocol, real-time inference budget, and discrete-action formulation are appropriate for the stated off-road offline behavioural-cloning objective. Scope-limit topics raised by reviewer 3 (Comments 2–5) are deferred to the new Future Works list in Section 8 ("Conclusion and Future Works") of the revised manuscript.</w:t>
+              <w:t xml:space="preserve">Yes; the cross-dataset training protocol, real-time inference budget, and discrete-action formulation are appropriate for the stated off-road offline behavioral-cloning objective. Scope-limit topics raised by reviewer 3 (Comments 2–5) are deferred to the new Future Works list in Section 8 ("Conclusion and Future Works") of the revised manuscript.</w:t>
             </w:r>
           </w:p>
         </w:tc>
@@ -281,7 +281,7 @@
     <w:p>
       <w:r>
         <w:rPr/>
-        <w:t xml:space="preserve">We will address this in the next revision via empirical decomposition: run four additional Phase 2 retrains, each with one component removed: (i) world model off (decision transformer reads raw BEV features), (ii) action chunking off ($K{=}1$, no TemporalEnsemble), (iii) TemporalEnsemble off ($K{=}5$ but argmax-per-frame instead of weighted average), and (iv) cross-dataset protocol off (Phase 1 also trained on RELLIS-3D). Each retrain is approximately 2 hours on a Quadro RTX 8000; the total compute is approximately 8 hours. Results will form a new subsection 6.3a "Component-wise decomposition" within the existing Ablation Studies section, with the per-component accuracy delta reported against the full-model baseline so that the dominant architectural contributors to cross-dataset generalisation are explicit. The planned experiments are clearly marked in Section 6 of the revised manuscript.</w:t>
+        <w:t xml:space="preserve">We will address this in the next revision via empirical decomposition: run four additional Phase 2 retrains, each with one component removed: (i) world model off (decision transformer reads raw BEV features), (ii) action chunking off ($K{=}1$, no TemporalEnsemble), (iii) TemporalEnsemble off ($K{=}5$ but argmax-per-frame instead of weighted average), and (iv) cross-dataset protocol off (Phase 1 also trained on RELLIS-3D). Each retrain is approximately 2 hours on a Quadro RTX 8000; the total compute is approximately 8 hours. Results will form a new subsection 6.3a "Component-wise decomposition" within the existing Ablation Studies section, with the per-component accuracy delta reported against the full-model baseline so that the dominant architectural contributors to cross-dataset generalization are explicit. The planned experiments are clearly marked in Section 6 of the revised manuscript.</w:t>
       </w:r>
     </w:p>
     <w:p>
@@ -312,7 +312,7 @@
       </w:r>
       <w:r>
         <w:rPr/>
-        <w:t xml:space="preserve"> We agree that integrated inertial-sensing robustness under degraded perception is an important question for any deployable off-road navigation system. However, it falls outside the present manuscript's scope: TerrainFormer is a learning-architecture contribution evaluated on offline LiDAR data with ground-truth poses, not a deployment-platform sensor-fusion study. Reliably addressing inertial / star-sensor fusion reliability, alignment stability, and fault-tolerant initialisation would require its own experimental apparatus (a vehicle with a calibrated IMU stack, controlled sensor-degradation conditions, etc.) that is not part of the present study. We have therefore renamed the paper's concluding section from "Conclusions" to </w:t>
+        <w:t xml:space="preserve"> We agree that integrated inertial-sensing robustness under degraded perception is an important question for any deployable off-road navigation system. However, it falls outside the present manuscript's scope: TerrainFormer is a learning-architecture contribution evaluated on offline LiDAR data with ground-truth poses, not a deployment-platform sensor-fusion study. Reliably addressing inertial / star-sensor fusion reliability, alignment stability, and fault-tolerant initialization would require its own experimental apparatus (a vehicle with a calibrated IMU stack, controlled sensor-degradation conditions, etc.) that is not part of the present study. We have therefore renamed the paper's concluding section from "Conclusions" to </w:t>
       </w:r>
       <w:r>
         <w:rPr>
@@ -348,7 +348,7 @@
       </w:r>
       <w:r>
         <w:rPr/>
-        <w:t xml:space="preserve"> A deployment-platform study of inertial-fusion reliability, alignment stability, and fault-tolerant initialisation when the primary LiDAR perception is degraded (heavy dust, fog, vegetation occlusion). This study would require a vehicle with a calibrated IMU stack and controlled degradation conditions, and would build on the inertial / star-sensor fusion principles described by Wang et al.~\cite{star_inertial_fusion}. The TerrainFormer architecture would consume the fused pose at inference time exactly as it does the LiDAR-derived pose today; the question is how the downstream action stream behaves when the upstream pose source loses its primary sensor."</w:t>
+        <w:t xml:space="preserve"> A deployment-platform study of inertial-fusion reliability, alignment stability, and fault-tolerant initialization when the primary LiDAR perception is degraded (heavy dust, fog, vegetation occlusion). This study would require a vehicle with a calibrated IMU stack and controlled degradation conditions, and would build on the inertial / star-sensor fusion principles described by Wang et al.~\cite{star_inertial_fusion}. The TerrainFormer architecture would consume the fused pose at inference time exactly as it does the LiDAR-derived pose today; the question is how the downstream action stream behaves when the upstream pose source loses its primary sensor."</w:t>
       </w:r>
     </w:p>
     <w:p>
@@ -452,7 +452,7 @@
       </w:r>
       <w:r>
         <w:rPr/>
-        <w:t xml:space="preserve"> We agree that the impact of sensor precision and accumulated pose drift on downstream decision quality is a relevant question. However, the present study uses ground-truth poses from the RELLIS-3D SLAM solution and does not run controlled noise-injection experiments; a rigorous analysis would require a separate experimental design (controlled pose-noise injection, IMU-error modelling, high-precision attitude-stabilisation comparison) that is outside the present manuscript's scope. We have added this analysis as the third item of the new Future Works subsection (Section 8).</w:t>
+        <w:t xml:space="preserve"> We agree that the impact of sensor precision and accumulated pose drift on downstream decision quality is a relevant question. However, the present study uses ground-truth poses from the RELLIS-3D SLAM solution and does not run controlled noise-injection experiments; a rigorous analysis would require a separate experimental design (controlled pose-noise injection, IMU-error modeling, high-precision attitude-stabilization comparison) that is outside the present manuscript's scope. We have added this analysis as the third item of the new Future Works subsection (Section 8).</w:t>
       </w:r>
     </w:p>
     <w:p>
@@ -478,7 +478,7 @@
       </w:r>
       <w:r>
         <w:rPr/>
-        <w:t xml:space="preserve"> A controlled noise-injection study where artificial IMU noise (varying densities and ring-pattern artefacts) is added to the goal-direction pose stream, and the resulting decision-stream stability is measured against the noise-free baseline. This study connects high-precision attitude stabilisation to downstream decision robustness."</w:t>
+        <w:t xml:space="preserve"> A controlled noise-injection study where artificial IMU noise (varying densities and ring-pattern artefacts) is added to the goal-direction pose stream, and the resulting decision-stream stability is measured against the noise-free baseline. This study connects high-precision attitude stabilization to downstream decision robustness."</w:t>
       </w:r>
     </w:p>
     <w:p>
@@ -509,7 +509,7 @@
       </w:r>
       <w:r>
         <w:rPr/>
-        <w:t xml:space="preserve"> We agree, and we note that the present manuscript is explicit about this scope limit (Section 7's "Simulation-Based Evaluation and Limitations" subsection states that the current evaluation is open-loop). Reliably validating closed-loop navigation safety, recovery capability, dynamic-obstacle reaction, terrain-discontinuity behaviour, and sensor-degradation recovery requires a closed-loop apparatus (simulation-in-the-loop on Gazebo / Isaac Sim, or field deployment on a physical Warthog) that is outside the scope of the present learning-architecture paper. We have added the four specific closed-loop experiments as the fourth item of the new Future Works subsection (Section 8).</w:t>
+        <w:t xml:space="preserve"> We agree, and we note that the present manuscript is explicit about this scope limit (Section 7's "Simulation-Based Evaluation and Limitations" subsection states that the current evaluation is open-loop). Reliably validating closed-loop navigation safety, recovery capability, dynamic-obstacle reaction, terrain-discontinuity behavior, and sensor-degradation recovery requires a closed-loop apparatus (simulation-in-the-loop on Gazebo / Isaac Sim, or field deployment on a physical Warthog) that is outside the scope of the present learning-architecture paper. We have added the four specific closed-loop experiments as the fourth item of the new Future Works subsection (Section 8).</w:t>
       </w:r>
     </w:p>
     <w:p>

</xml_diff>